<commit_message>
feat & perf: optimasi kecepatan, kompresi gambar, dan perbaikan build
- Mengimplementasikan fungsi Supabase RPC untuk memuat statistik Dasbor 10x lebih cepat (menggabungkan multi-kueri menjadi 1 kueri).

- Menambahkan kompresi gambar di sisi klien (browser-image-compression) agar upload foto jauh lebih cepat dan hemat kuota.

- Memperbaiki bug upload multi-foto agar dapat mengirim seluruh foto secara paralel.

- Memigrasikan tag HTML <img> menjadi komponen Next.js <Image>.

- Menghapus teks logo 'UN' pada animasi loading.

- Memperbaiki error TypeScript pada fitur ekspor dan sukses build Vercel.
</commit_message>
<xml_diff>
--- a/template/template_logbook.docx
+++ b/template/template_logbook.docx
@@ -431,6 +431,26 @@
         </w:rPr>
       </w:r>
     </w:p>
+    <w:p>
+      <w:r>
+        <w:t>{#weeks}</w:t>
+      </w:r>
+    </w:p>
+    <w:p>
+      <w:pPr>
+        <w:jc w:val="center"/>
+        <w:rPr>
+          <w:b/>
+        </w:rPr>
+      </w:pPr>
+      <w:r>
+        <w:rPr>
+          <w:b/>
+        </w:rPr>
+        <w:t>Pekan {week_number}</w:t>
+      </w:r>
+    </w:p>
+    <w:p/>
     <w:tbl>
       <w:tblPr>
         <w:tblStyle w:val="Table1"/>
@@ -830,7 +850,53 @@
           </w:p>
         </w:tc>
       </w:tr>
+      <w:tr>
+        <w:tc>
+          <w:tcPr>
+            <w:gridSpan w:val="5"/>
+          </w:tcPr>
+          <w:p>
+            <w:pPr>
+              <w:jc w:val="right"/>
+              <w:rPr>
+                <w:b/>
+              </w:rPr>
+            </w:pPr>
+            <w:r>
+              <w:rPr>
+                <w:b/>
+              </w:rPr>
+              <w:t>Total Durasi Pekan Ini:</w:t>
+            </w:r>
+          </w:p>
+        </w:tc>
+        <w:tc>
+          <w:tcPr>
+            <w:gridSpan w:val="2"/>
+          </w:tcPr>
+          <w:p>
+            <w:pPr>
+              <w:jc w:val="center"/>
+              <w:rPr>
+                <w:b/>
+              </w:rPr>
+            </w:pPr>
+            <w:r>
+              <w:rPr>
+                <w:b/>
+              </w:rPr>
+              <w:t>{total_duration}</w:t>
+            </w:r>
+          </w:p>
+        </w:tc>
+      </w:tr>
     </w:tbl>
+    <w:p>
+      <w:r>
+        <w:t>{/weeks}</w:t>
+      </w:r>
+    </w:p>
+    <w:p/>
     <w:p>
       <w:pPr>
         <w:jc w:val="center"/>

</xml_diff>